<commit_message>
Finalizada con pdf y link a la web Netfly
</commit_message>
<xml_diff>
--- a/Proyecto3_InfoVis.docx
+++ b/Proyecto3_InfoVis.docx
@@ -27,7 +27,25 @@
           <w:sz w:val="36"/>
           <w:szCs w:val="36"/>
         </w:rPr>
-        <w:t>Red de Cursos — Ingeniería en Materiales</w:t>
+        <w:t xml:space="preserve">Red de Cursos </w:t>
+      </w:r>
+      <w:r>
+        <w:rPr>
+          <w:b/>
+          <w:bCs/>
+          <w:sz w:val="36"/>
+          <w:szCs w:val="36"/>
+        </w:rPr>
+        <w:t xml:space="preserve">de </w:t>
+      </w:r>
+      <w:r>
+        <w:rPr>
+          <w:b/>
+          <w:bCs/>
+          <w:sz w:val="36"/>
+          <w:szCs w:val="36"/>
+        </w:rPr>
+        <w:t>Ingeniería en Materiales</w:t>
       </w:r>
     </w:p>
     <w:p>
@@ -111,12 +129,6 @@
         <w:gridCol w:w="5200"/>
       </w:tblGrid>
       <w:tr>
-        <w:tblPrEx>
-          <w:tblCellMar>
-            <w:top w:w="0" w:type="dxa"/>
-            <w:bottom w:w="0" w:type="dxa"/>
-          </w:tblCellMar>
-        </w:tblPrEx>
         <w:trPr>
           <w:jc w:val="center"/>
         </w:trPr>
@@ -158,12 +170,6 @@
         </w:tc>
       </w:tr>
       <w:tr>
-        <w:tblPrEx>
-          <w:tblCellMar>
-            <w:top w:w="0" w:type="dxa"/>
-            <w:bottom w:w="0" w:type="dxa"/>
-          </w:tblCellMar>
-        </w:tblPrEx>
         <w:trPr>
           <w:jc w:val="center"/>
         </w:trPr>
@@ -217,12 +223,6 @@
         </w:tc>
       </w:tr>
       <w:tr>
-        <w:tblPrEx>
-          <w:tblCellMar>
-            <w:top w:w="0" w:type="dxa"/>
-            <w:bottom w:w="0" w:type="dxa"/>
-          </w:tblCellMar>
-        </w:tblPrEx>
         <w:trPr>
           <w:jc w:val="center"/>
         </w:trPr>
@@ -270,12 +270,6 @@
         </w:tc>
       </w:tr>
       <w:tr>
-        <w:tblPrEx>
-          <w:tblCellMar>
-            <w:top w:w="0" w:type="dxa"/>
-            <w:bottom w:w="0" w:type="dxa"/>
-          </w:tblCellMar>
-        </w:tblPrEx>
         <w:trPr>
           <w:jc w:val="center"/>
         </w:trPr>
@@ -317,12 +311,6 @@
         </w:tc>
       </w:tr>
       <w:tr>
-        <w:tblPrEx>
-          <w:tblCellMar>
-            <w:top w:w="0" w:type="dxa"/>
-            <w:bottom w:w="0" w:type="dxa"/>
-          </w:tblCellMar>
-        </w:tblPrEx>
         <w:trPr>
           <w:jc w:val="center"/>
         </w:trPr>
@@ -368,19 +356,19 @@
                 <w:rPr>
                   <w:rStyle w:val="Hipervnculo"/>
                 </w:rPr>
-                <w:t>https://melodic-klepo</w:t>
+                <w:t>https://melod</w:t>
               </w:r>
               <w:r>
                 <w:rPr>
                   <w:rStyle w:val="Hipervnculo"/>
                 </w:rPr>
-                <w:t>n</w:t>
+                <w:t>i</w:t>
               </w:r>
               <w:r>
                 <w:rPr>
                   <w:rStyle w:val="Hipervnculo"/>
                 </w:rPr>
-                <w:t>-03d198.netlify.app/</w:t>
+                <w:t>c-klepon-03d198.netlify.app/</w:t>
               </w:r>
             </w:hyperlink>
           </w:p>
@@ -434,10 +422,7 @@
         <w:jc w:val="both"/>
       </w:pPr>
       <w:r>
-        <w:t>E</w:t>
-      </w:r>
-      <w:r>
-        <w:t>l presente proyecto desarrolla una visualización interactiva de la red de cursos de la carrera de Ingeniería en Materiales del Tecnológico de Costa Rica (TEC), Plan 1217. La gráfica generada permite explorar visualmente la secuencia de cursos, sus requisitos, correquisitos, áreas de conocimiento, créditos y carga horaria, todo en una sola vista integrada.</w:t>
+        <w:t>El presente proyecto desarrolla una visualización interactiva de la red de cursos de la carrera de Ingeniería en Materiales del Tecnológico de Costa Rica (TEC), Plan 1217. La gráfica generada permite explorar visualmente la secuencia de cursos, sus requisitos, correquisitos, áreas de conocimiento, créditos y carga horaria, todo en una sola vista integrada.</w:t>
       </w:r>
     </w:p>
     <w:p>
@@ -501,10 +486,7 @@
         <w:jc w:val="both"/>
       </w:pPr>
       <w:r>
-        <w:t>El plan de estudios de Ingeniería en Materiales del TEC está compuesto por 58 cursos distribuidos en 9 bloques (semestre 0 al 8</w:t>
-      </w:r>
-      <w:r>
-        <w:t>). Estos cursos pertenecen a 11 áreas de conocimiento distintas y se conectan entre sí mediante 77 relaciones: 62 de tipo requisito y 15 de tipo correquisito.</w:t>
+        <w:t>El plan de estudios de Ingeniería en Materiales del TEC está compuesto por 58 cursos distribuidos en 9 bloques (semestre 0 al 8). Estos cursos pertenecen a 11 áreas de conocimiento distintas y se conectan entre sí mediante 77 relaciones: 62 de tipo requisito y 15 de tipo correquisito.</w:t>
       </w:r>
     </w:p>
     <w:p>
@@ -618,10 +600,7 @@
         <w:jc w:val="both"/>
       </w:pPr>
       <w:r>
-        <w:t>La fuente primaria de datos es el plan de estudios oficial de la carrera de Ingeniería en Materiales del TEC, disponible en el sitio web institucional. Los datos fueron recopilados y estructurados en un archivo JSON</w:t>
-      </w:r>
-      <w:r>
-        <w:t>.</w:t>
+        <w:t>La fuente primaria de datos es el plan de estudios oficial de la carrera de Ingeniería en Materiales del TEC, disponible en el sitio web institucional. Los datos fueron recopilados y estructurados en un archivo JSON.</w:t>
       </w:r>
     </w:p>
     <w:p>
@@ -688,12 +667,6 @@
         <w:gridCol w:w="1800"/>
       </w:tblGrid>
       <w:tr>
-        <w:tblPrEx>
-          <w:tblCellMar>
-            <w:top w:w="0" w:type="dxa"/>
-            <w:bottom w:w="0" w:type="dxa"/>
-          </w:tblCellMar>
-        </w:tblPrEx>
         <w:trPr>
           <w:tblHeader/>
         </w:trPr>
@@ -784,12 +757,6 @@
         </w:tc>
       </w:tr>
       <w:tr>
-        <w:tblPrEx>
-          <w:tblCellMar>
-            <w:top w:w="0" w:type="dxa"/>
-            <w:bottom w:w="0" w:type="dxa"/>
-          </w:tblCellMar>
-        </w:tblPrEx>
         <w:tc>
           <w:tcPr>
             <w:tcW w:w="1800" w:type="dxa"/>
@@ -870,12 +837,6 @@
         </w:tc>
       </w:tr>
       <w:tr>
-        <w:tblPrEx>
-          <w:tblCellMar>
-            <w:top w:w="0" w:type="dxa"/>
-            <w:bottom w:w="0" w:type="dxa"/>
-          </w:tblCellMar>
-        </w:tblPrEx>
         <w:tc>
           <w:tcPr>
             <w:tcW w:w="1800" w:type="dxa"/>
@@ -1003,12 +964,6 @@
         <w:gridCol w:w="5600"/>
       </w:tblGrid>
       <w:tr>
-        <w:tblPrEx>
-          <w:tblCellMar>
-            <w:top w:w="0" w:type="dxa"/>
-            <w:bottom w:w="0" w:type="dxa"/>
-          </w:tblCellMar>
-        </w:tblPrEx>
         <w:trPr>
           <w:tblHeader/>
         </w:trPr>
@@ -1098,12 +1053,6 @@
         </w:tc>
       </w:tr>
       <w:tr>
-        <w:tblPrEx>
-          <w:tblCellMar>
-            <w:top w:w="0" w:type="dxa"/>
-            <w:bottom w:w="0" w:type="dxa"/>
-          </w:tblCellMar>
-        </w:tblPrEx>
         <w:tc>
           <w:tcPr>
             <w:tcW w:w="1800" w:type="dxa"/>
@@ -1184,12 +1133,6 @@
         </w:tc>
       </w:tr>
       <w:tr>
-        <w:tblPrEx>
-          <w:tblCellMar>
-            <w:top w:w="0" w:type="dxa"/>
-            <w:bottom w:w="0" w:type="dxa"/>
-          </w:tblCellMar>
-        </w:tblPrEx>
         <w:tc>
           <w:tcPr>
             <w:tcW w:w="1800" w:type="dxa"/>
@@ -1284,12 +1227,6 @@
         </w:tc>
       </w:tr>
       <w:tr>
-        <w:tblPrEx>
-          <w:tblCellMar>
-            <w:top w:w="0" w:type="dxa"/>
-            <w:bottom w:w="0" w:type="dxa"/>
-          </w:tblCellMar>
-        </w:tblPrEx>
         <w:tc>
           <w:tcPr>
             <w:tcW w:w="1800" w:type="dxa"/>
@@ -1370,12 +1307,6 @@
         </w:tc>
       </w:tr>
       <w:tr>
-        <w:tblPrEx>
-          <w:tblCellMar>
-            <w:top w:w="0" w:type="dxa"/>
-            <w:bottom w:w="0" w:type="dxa"/>
-          </w:tblCellMar>
-        </w:tblPrEx>
         <w:tc>
           <w:tcPr>
             <w:tcW w:w="1800" w:type="dxa"/>
@@ -1458,12 +1389,6 @@
         </w:tc>
       </w:tr>
       <w:tr>
-        <w:tblPrEx>
-          <w:tblCellMar>
-            <w:top w:w="0" w:type="dxa"/>
-            <w:bottom w:w="0" w:type="dxa"/>
-          </w:tblCellMar>
-        </w:tblPrEx>
         <w:tc>
           <w:tcPr>
             <w:tcW w:w="1800" w:type="dxa"/>
@@ -1551,12 +1476,6 @@
         </w:tc>
       </w:tr>
       <w:tr>
-        <w:tblPrEx>
-          <w:tblCellMar>
-            <w:top w:w="0" w:type="dxa"/>
-            <w:bottom w:w="0" w:type="dxa"/>
-          </w:tblCellMar>
-        </w:tblPrEx>
         <w:tc>
           <w:tcPr>
             <w:tcW w:w="1800" w:type="dxa"/>
@@ -1691,12 +1610,6 @@
         <w:gridCol w:w="1800"/>
       </w:tblGrid>
       <w:tr>
-        <w:tblPrEx>
-          <w:tblCellMar>
-            <w:top w:w="0" w:type="dxa"/>
-            <w:bottom w:w="0" w:type="dxa"/>
-          </w:tblCellMar>
-        </w:tblPrEx>
         <w:trPr>
           <w:tblHeader/>
         </w:trPr>
@@ -1786,12 +1699,6 @@
         </w:tc>
       </w:tr>
       <w:tr>
-        <w:tblPrEx>
-          <w:tblCellMar>
-            <w:top w:w="0" w:type="dxa"/>
-            <w:bottom w:w="0" w:type="dxa"/>
-          </w:tblCellMar>
-        </w:tblPrEx>
         <w:tc>
           <w:tcPr>
             <w:tcW w:w="4200" w:type="dxa"/>
@@ -1872,12 +1779,6 @@
         </w:tc>
       </w:tr>
       <w:tr>
-        <w:tblPrEx>
-          <w:tblCellMar>
-            <w:top w:w="0" w:type="dxa"/>
-            <w:bottom w:w="0" w:type="dxa"/>
-          </w:tblCellMar>
-        </w:tblPrEx>
         <w:tc>
           <w:tcPr>
             <w:tcW w:w="4200" w:type="dxa"/>
@@ -1958,12 +1859,6 @@
         </w:tc>
       </w:tr>
       <w:tr>
-        <w:tblPrEx>
-          <w:tblCellMar>
-            <w:top w:w="0" w:type="dxa"/>
-            <w:bottom w:w="0" w:type="dxa"/>
-          </w:tblCellMar>
-        </w:tblPrEx>
         <w:tc>
           <w:tcPr>
             <w:tcW w:w="4200" w:type="dxa"/>
@@ -2044,12 +1939,6 @@
         </w:tc>
       </w:tr>
       <w:tr>
-        <w:tblPrEx>
-          <w:tblCellMar>
-            <w:top w:w="0" w:type="dxa"/>
-            <w:bottom w:w="0" w:type="dxa"/>
-          </w:tblCellMar>
-        </w:tblPrEx>
         <w:tc>
           <w:tcPr>
             <w:tcW w:w="4200" w:type="dxa"/>
@@ -2130,12 +2019,6 @@
         </w:tc>
       </w:tr>
       <w:tr>
-        <w:tblPrEx>
-          <w:tblCellMar>
-            <w:top w:w="0" w:type="dxa"/>
-            <w:bottom w:w="0" w:type="dxa"/>
-          </w:tblCellMar>
-        </w:tblPrEx>
         <w:tc>
           <w:tcPr>
             <w:tcW w:w="4200" w:type="dxa"/>
@@ -2216,12 +2099,6 @@
         </w:tc>
       </w:tr>
       <w:tr>
-        <w:tblPrEx>
-          <w:tblCellMar>
-            <w:top w:w="0" w:type="dxa"/>
-            <w:bottom w:w="0" w:type="dxa"/>
-          </w:tblCellMar>
-        </w:tblPrEx>
         <w:tc>
           <w:tcPr>
             <w:tcW w:w="4200" w:type="dxa"/>
@@ -2302,12 +2179,6 @@
         </w:tc>
       </w:tr>
       <w:tr>
-        <w:tblPrEx>
-          <w:tblCellMar>
-            <w:top w:w="0" w:type="dxa"/>
-            <w:bottom w:w="0" w:type="dxa"/>
-          </w:tblCellMar>
-        </w:tblPrEx>
         <w:tc>
           <w:tcPr>
             <w:tcW w:w="4200" w:type="dxa"/>
@@ -2388,12 +2259,6 @@
         </w:tc>
       </w:tr>
       <w:tr>
-        <w:tblPrEx>
-          <w:tblCellMar>
-            <w:top w:w="0" w:type="dxa"/>
-            <w:bottom w:w="0" w:type="dxa"/>
-          </w:tblCellMar>
-        </w:tblPrEx>
         <w:tc>
           <w:tcPr>
             <w:tcW w:w="4200" w:type="dxa"/>
@@ -2474,12 +2339,6 @@
         </w:tc>
       </w:tr>
       <w:tr>
-        <w:tblPrEx>
-          <w:tblCellMar>
-            <w:top w:w="0" w:type="dxa"/>
-            <w:bottom w:w="0" w:type="dxa"/>
-          </w:tblCellMar>
-        </w:tblPrEx>
         <w:tc>
           <w:tcPr>
             <w:tcW w:w="4200" w:type="dxa"/>
@@ -2560,12 +2419,6 @@
         </w:tc>
       </w:tr>
       <w:tr>
-        <w:tblPrEx>
-          <w:tblCellMar>
-            <w:top w:w="0" w:type="dxa"/>
-            <w:bottom w:w="0" w:type="dxa"/>
-          </w:tblCellMar>
-        </w:tblPrEx>
         <w:tc>
           <w:tcPr>
             <w:tcW w:w="4200" w:type="dxa"/>
@@ -2646,12 +2499,6 @@
         </w:tc>
       </w:tr>
       <w:tr>
-        <w:tblPrEx>
-          <w:tblCellMar>
-            <w:top w:w="0" w:type="dxa"/>
-            <w:bottom w:w="0" w:type="dxa"/>
-          </w:tblCellMar>
-        </w:tblPrEx>
         <w:tc>
           <w:tcPr>
             <w:tcW w:w="4200" w:type="dxa"/>
@@ -2732,12 +2579,6 @@
         </w:tc>
       </w:tr>
       <w:tr>
-        <w:tblPrEx>
-          <w:tblCellMar>
-            <w:top w:w="0" w:type="dxa"/>
-            <w:bottom w:w="0" w:type="dxa"/>
-          </w:tblCellMar>
-        </w:tblPrEx>
         <w:tc>
           <w:tcPr>
             <w:tcW w:w="4200" w:type="dxa"/>
@@ -2976,12 +2817,6 @@
         <w:gridCol w:w="4000"/>
       </w:tblGrid>
       <w:tr>
-        <w:tblPrEx>
-          <w:tblCellMar>
-            <w:top w:w="0" w:type="dxa"/>
-            <w:bottom w:w="0" w:type="dxa"/>
-          </w:tblCellMar>
-        </w:tblPrEx>
         <w:trPr>
           <w:tblHeader/>
         </w:trPr>
@@ -3071,12 +2906,6 @@
         </w:tc>
       </w:tr>
       <w:tr>
-        <w:tblPrEx>
-          <w:tblCellMar>
-            <w:top w:w="0" w:type="dxa"/>
-            <w:bottom w:w="0" w:type="dxa"/>
-          </w:tblCellMar>
-        </w:tblPrEx>
         <w:tc>
           <w:tcPr>
             <w:tcW w:w="2400" w:type="dxa"/>
@@ -3198,12 +3027,6 @@
         </w:tc>
       </w:tr>
       <w:tr>
-        <w:tblPrEx>
-          <w:tblCellMar>
-            <w:top w:w="0" w:type="dxa"/>
-            <w:bottom w:w="0" w:type="dxa"/>
-          </w:tblCellMar>
-        </w:tblPrEx>
         <w:tc>
           <w:tcPr>
             <w:tcW w:w="2400" w:type="dxa"/>
@@ -3284,12 +3107,6 @@
         </w:tc>
       </w:tr>
       <w:tr>
-        <w:tblPrEx>
-          <w:tblCellMar>
-            <w:top w:w="0" w:type="dxa"/>
-            <w:bottom w:w="0" w:type="dxa"/>
-          </w:tblCellMar>
-        </w:tblPrEx>
         <w:tc>
           <w:tcPr>
             <w:tcW w:w="2400" w:type="dxa"/>
@@ -3402,12 +3219,6 @@
         </w:tc>
       </w:tr>
       <w:tr>
-        <w:tblPrEx>
-          <w:tblCellMar>
-            <w:top w:w="0" w:type="dxa"/>
-            <w:bottom w:w="0" w:type="dxa"/>
-          </w:tblCellMar>
-        </w:tblPrEx>
         <w:tc>
           <w:tcPr>
             <w:tcW w:w="2400" w:type="dxa"/>
@@ -3488,12 +3299,6 @@
         </w:tc>
       </w:tr>
       <w:tr>
-        <w:tblPrEx>
-          <w:tblCellMar>
-            <w:top w:w="0" w:type="dxa"/>
-            <w:bottom w:w="0" w:type="dxa"/>
-          </w:tblCellMar>
-        </w:tblPrEx>
         <w:tc>
           <w:tcPr>
             <w:tcW w:w="2400" w:type="dxa"/>
@@ -3574,12 +3379,6 @@
         </w:tc>
       </w:tr>
       <w:tr>
-        <w:tblPrEx>
-          <w:tblCellMar>
-            <w:top w:w="0" w:type="dxa"/>
-            <w:bottom w:w="0" w:type="dxa"/>
-          </w:tblCellMar>
-        </w:tblPrEx>
         <w:tc>
           <w:tcPr>
             <w:tcW w:w="2400" w:type="dxa"/>
@@ -3660,12 +3459,6 @@
         </w:tc>
       </w:tr>
       <w:tr>
-        <w:tblPrEx>
-          <w:tblCellMar>
-            <w:top w:w="0" w:type="dxa"/>
-            <w:bottom w:w="0" w:type="dxa"/>
-          </w:tblCellMar>
-        </w:tblPrEx>
         <w:tc>
           <w:tcPr>
             <w:tcW w:w="2400" w:type="dxa"/>
@@ -3978,25 +3771,7 @@
         <w:jc w:val="both"/>
       </w:pPr>
       <w:r>
-        <w:t xml:space="preserve">La página web implementa todas las funcionalidades requeridas mediante las librerías </w:t>
-      </w:r>
-      <w:r>
-        <w:t>simple-table.js</w:t>
-      </w:r>
-      <w:r>
-        <w:t xml:space="preserve">, </w:t>
-      </w:r>
-      <w:r>
-        <w:t>svg-controls.js</w:t>
-      </w:r>
-      <w:r>
-        <w:t xml:space="preserve"> y </w:t>
-      </w:r>
-      <w:r>
-        <w:t>simple-details.js</w:t>
-      </w:r>
-      <w:r>
-        <w:t>:</w:t>
+        <w:t>La página web implementa todas las funcionalidades requeridas mediante las librerías simple-table.js, svg-controls.js y simple-details.js:</w:t>
       </w:r>
     </w:p>
     <w:p>
@@ -4300,10 +4075,7 @@
       </w:r>
       <w:proofErr w:type="spellEnd"/>
       <w:r>
-        <w:t xml:space="preserve"> transforma una imagen en una herramienta </w:t>
-      </w:r>
-      <w:r>
-        <w:t>completa. El filtrado sincronizado entre tabla y SVG es especialmente útil para analizar subconjuntos del plan por área.</w:t>
+        <w:t xml:space="preserve"> transforma una imagen en una herramienta completa. El filtrado sincronizado entre tabla y SVG es especialmente útil para analizar subconjuntos del plan por área.</w:t>
       </w:r>
     </w:p>
     <w:p>

</xml_diff>